<commit_message>
Fix duplicate appearances from date format mismatch & update docs
- Normalize all meeting dates to ISO YYYY-MM-DD in repository.py
- Add startup migration to merge existing duplicate meetings (db.py)
- Add fmtDate() JS helper for friendly date display in the UI
- Update Help & Reference with new feature entries
- Rebuild Technical Brief, User Guide, and Elevator Pitches with
  cross-stage tracking, change detection, and lifecycle sections

Co-Authored-By: Claude Opus 4.6 <noreply@anthropic.com>
</commit_message>
<xml_diff>
--- a/AgendaIQ_Elevator_Pitches.docx
+++ b/AgendaIQ_Elevator_Pitches.docx
@@ -75,7 +75,7 @@
           <w:sz w:val="22"/>
           <w:szCs w:val="22"/>
         </w:rPr>
-        <w:t xml:space="preserve">AgendaIQ is a Flask web app I built to turn Miami-Dade's 500-page commission agendas into something the OCA can actually work with in minutes instead of days. When a new agenda drops on Legistar, the app scrapes it, pulls every linked PDF, runs them through PyMuPDF and Tesseract OCR so even scanned documents become searchable text, and then sends each item to the Anthropic Claude API with a structured prompt that extracts the OCA angle — what matters, what to watch, what to flag. Everything lands in a SQLite database with full audit trails, assignment tracking, notes, and a Part 1 debrief workflow. The front end is a single-page Flask app with mobile-responsive HTML, Server-Sent Events for live progress, and native date pickers. It exports to Word and Excel with python-docx and openpyxl. It's deployed on Render.com as a Blueprint — GitHub pushes auto-deploy, a 1-gigabyte persistent disk holds the database and PDF cache, env vars hold the secrets, and HTTP Basic Auth gates the demo. Nightly backups gzip a consistent SQLite snapshot to Backblaze B2. Total run cost is twenty to fifty dollars a month for server plus AI combined, with three built-in optimizations that cut API costs by seventy to ninety percent: smart PDF trimming, prompt caching, and content-hash deduplication. When the county green-lights it, the path to production is SSO via Microsoft MSAL and a swap to managed Postgres — no schema changes required.</w:t>
+        <w:t xml:space="preserve">AgendaIQ is a Flask web app I built to turn Miami-Dade's 500-page commission agendas into something the OCA can actually work with in minutes instead of days. When a new agenda drops on Legistar, the app scrapes it, pulls every linked PDF, runs them through PyMuPDF and Tesseract OCR so even scanned documents become searchable text, and then sends each item to the Anthropic Claude API with a structured prompt that extracts the OCA angle — what matters, what to watch, what to flag. It tracks every item across stages — when something heard at committee shows up on the BCC agenda, it automatically carries forward the researcher's notes and runs a change-detection analysis comparing the two versions so you instantly see what was amended. The full Legistar legislative history is parsed into a timeline for each item. Everything lands in a SQLite database with full audit trails, assignment tracking, notes, and a Part 1 debrief workflow. The front end is a single-page Flask app with mobile-responsive HTML, Server-Sent Events for live progress, and native date pickers. It exports to Word and Excel with python-docx and openpyxl. It's deployed on Render.com as a Blueprint — GitHub pushes auto-deploy, a 1-gigabyte persistent disk holds the database and PDF cache, env vars hold the secrets, and HTTP Basic Auth gates the demo. Nightly backups gzip a consistent SQLite snapshot to Backblaze B2. Total run cost is twenty to fifty dollars a month for server plus AI combined, with three built-in optimizations that cut API costs by seventy to ninety percent: smart PDF trimming, prompt caching, and content-hash deduplication. When the county green-lights it, the path to production is SSO via Microsoft MSAL and a swap to managed Postgres — no schema changes required.</w:t>
       </w:r>
     </w:p>
     <w:p>
@@ -558,6 +558,162 @@
           <w:szCs w:val="22"/>
         </w:rPr>
         <w:t xml:space="preserve">, assignment tracking, notes, and a Part 1 debrief workflow.</w:t>
+      </w:r>
+    </w:p>
+    <w:p>
+      <w:pPr>
+        <w:spacing w:after="200" w:line="340"/>
+      </w:pPr>
+      <w:r>
+        <w:rPr>
+          <w:sz w:val="22"/>
+          <w:szCs w:val="22"/>
+        </w:rPr>
+        <w:t xml:space="preserve">It tracks every item across stages — when something heard at committee shows up on the </w:t>
+      </w:r>
+      <w:r>
+        <w:rPr>
+          <w:b/>
+          <w:bCs/>
+          <w:color w:val="003087"/>
+          <w:sz w:val="22"/>
+          <w:szCs w:val="22"/>
+        </w:rPr>
+        <w:t xml:space="preserve">BCC agenda</w:t>
+      </w:r>
+      <w:r>
+        <w:rPr>
+          <w:i/>
+          <w:iCs/>
+          <w:color w:val="6B7280"/>
+          <w:sz w:val="22"/>
+          <w:szCs w:val="22"/>
+        </w:rPr>
+        <w:t xml:space="preserve"> — </w:t>
+      </w:r>
+      <w:r>
+        <w:rPr>
+          <w:i/>
+          <w:iCs/>
+          <w:color w:val="6B7280"/>
+          <w:sz w:val="22"/>
+          <w:szCs w:val="22"/>
+        </w:rPr>
+        <w:t xml:space="preserve">the Board of County Commissioners agenda — the final, full-board meeting where items get voted on</w:t>
+      </w:r>
+      <w:r>
+        <w:rPr>
+          <w:sz w:val="22"/>
+          <w:szCs w:val="22"/>
+        </w:rPr>
+        <w:t xml:space="preserve"> </w:t>
+      </w:r>
+      <w:r>
+        <w:rPr>
+          <w:sz w:val="22"/>
+          <w:szCs w:val="22"/>
+        </w:rPr>
+        <w:t xml:space="preserve">, it automatically carries forward the researcher's notes and runs a </w:t>
+      </w:r>
+      <w:r>
+        <w:rPr>
+          <w:b/>
+          <w:bCs/>
+          <w:color w:val="003087"/>
+          <w:sz w:val="22"/>
+          <w:szCs w:val="22"/>
+        </w:rPr>
+        <w:t xml:space="preserve">change-detection analysis</w:t>
+      </w:r>
+      <w:r>
+        <w:rPr>
+          <w:i/>
+          <w:iCs/>
+          <w:color w:val="6B7280"/>
+          <w:sz w:val="22"/>
+          <w:szCs w:val="22"/>
+        </w:rPr>
+        <w:t xml:space="preserve"> — </w:t>
+      </w:r>
+      <w:r>
+        <w:rPr>
+          <w:i/>
+          <w:iCs/>
+          <w:color w:val="6B7280"/>
+          <w:sz w:val="22"/>
+          <w:szCs w:val="22"/>
+        </w:rPr>
+        <w:t xml:space="preserve">an AI comparison of the committee version and the BCC version that flags what was amended — dollar amounts, conditions, scope, added or removed sections</w:t>
+      </w:r>
+      <w:r>
+        <w:rPr>
+          <w:sz w:val="22"/>
+          <w:szCs w:val="22"/>
+        </w:rPr>
+        <w:t xml:space="preserve"> </w:t>
+      </w:r>
+      <w:r>
+        <w:rPr>
+          <w:sz w:val="22"/>
+          <w:szCs w:val="22"/>
+        </w:rPr>
+        <w:t xml:space="preserve"> comparing the two versions so you instantly see what was amended.</w:t>
+      </w:r>
+    </w:p>
+    <w:p>
+      <w:pPr>
+        <w:spacing w:after="200" w:line="340"/>
+      </w:pPr>
+      <w:r>
+        <w:rPr>
+          <w:sz w:val="22"/>
+          <w:szCs w:val="22"/>
+        </w:rPr>
+        <w:t xml:space="preserve">The full </w:t>
+      </w:r>
+      <w:r>
+        <w:rPr>
+          <w:b/>
+          <w:bCs/>
+          <w:color w:val="003087"/>
+          <w:sz w:val="22"/>
+          <w:szCs w:val="22"/>
+        </w:rPr>
+        <w:t xml:space="preserve">Legistar legislative history</w:t>
+      </w:r>
+      <w:r>
+        <w:rPr>
+          <w:i/>
+          <w:iCs/>
+          <w:color w:val="6B7280"/>
+          <w:sz w:val="22"/>
+          <w:szCs w:val="22"/>
+        </w:rPr>
+        <w:t xml:space="preserve"> — </w:t>
+      </w:r>
+      <w:r>
+        <w:rPr>
+          <w:i/>
+          <w:iCs/>
+          <w:color w:val="6B7280"/>
+          <w:sz w:val="22"/>
+          <w:szCs w:val="22"/>
+        </w:rPr>
+        <w:t xml:space="preserve">Legistar keeps a record of every action taken on an item — who heard it, when, what they did — from first filing through final vote</w:t>
+      </w:r>
+      <w:r>
+        <w:rPr>
+          <w:sz w:val="22"/>
+          <w:szCs w:val="22"/>
+        </w:rPr>
+        <w:t xml:space="preserve"> </w:t>
+      </w:r>
+      <w:r>
+        <w:rPr>
+          <w:sz w:val="22"/>
+          <w:szCs w:val="22"/>
+        </w:rPr>
+        <w:t xml:space="preserve"> is parsed into a timeline for each item.</w:t>
       </w:r>
     </w:p>
     <w:p>

</xml_diff>

<commit_message>
Update all docs: Planner roadmap, Help tab, editable notes, bulk assign
Elevator Pitches: Added Microsoft Planner integration to both the
technical and plain-English pitches, plus cheat sheet entries for
Microsoft Graph and Planner sync.

Technical Brief: Added Production Roadmap section (SSO + Planner
integration phases) and Built-In Help System section.

User Guide: Added section 11 (Help & Reference), updated section 5
to cover editable notes and combined bulk assign + due date, renumbered
Tips & Troubleshooting to section 12.

Co-Authored-By: Claude Opus 4.6 <noreply@anthropic.com>
</commit_message>
<xml_diff>
--- a/AgendaIQ_Elevator_Pitches.docx
+++ b/AgendaIQ_Elevator_Pitches.docx
@@ -75,7 +75,7 @@
           <w:sz w:val="22"/>
           <w:szCs w:val="22"/>
         </w:rPr>
-        <w:t xml:space="preserve">AgendaIQ is a Flask web app I built to turn Miami-Dade's 500-page commission agendas into something the OCA can actually work with in minutes instead of days. When a new agenda drops on Legistar, the app scrapes it, pulls every linked PDF, runs them through PyMuPDF and Tesseract OCR so even scanned documents become searchable text, and then sends each item to the Anthropic Claude API with a structured prompt that extracts the OCA angle — what matters, what to watch, what to flag. It tracks every item across stages — when something heard at committee shows up on the BCC agenda, it automatically carries forward the researcher's notes and runs a change-detection analysis comparing the two versions so you instantly see what was amended. The full Legistar legislative history is parsed into a timeline for each item. Everything lands in a SQLite database with full audit trails, assignment tracking, notes, and a Part 1 debrief workflow. The front end is a single-page Flask app with mobile-responsive HTML, Server-Sent Events for live progress, and native date pickers. It exports to Word and Excel with python-docx and openpyxl. It's deployed on Render.com as a Blueprint — GitHub pushes auto-deploy, a 1-gigabyte persistent disk holds the database and PDF cache, env vars hold the secrets, and HTTP Basic Auth gates the demo. Nightly backups gzip a consistent SQLite snapshot to Backblaze B2. Total run cost is twenty to fifty dollars a month for server plus AI combined, with three built-in optimizations that cut API costs by seventy to ninety percent: smart PDF trimming, prompt caching, and content-hash deduplication. When the county green-lights it, the path to production is SSO via Microsoft MSAL and a swap to managed Postgres — no schema changes required.</w:t>
+        <w:t xml:space="preserve">AgendaIQ is a Flask web app I built to turn Miami-Dade's 500-page commission agendas into something the OCA can actually work with in minutes instead of days. When a new agenda drops on Legistar, the app scrapes it, pulls every linked PDF, runs them through PyMuPDF and Tesseract OCR so even scanned documents become searchable text, and then sends each item to the Anthropic Claude API with a structured prompt that extracts the OCA angle — what matters, what to watch, what to flag. It tracks every item across stages — when something heard at committee shows up on the BCC agenda, it automatically carries forward the researcher's notes and runs a change-detection analysis comparing the two versions so you instantly see what was amended. The full Legistar legislative history is parsed into a timeline for each item. Everything lands in a SQLite database with full audit trails, assignment tracking, notes, and a Part 1 debrief workflow. The front end is a single-page Flask app with mobile-responsive HTML, Server-Sent Events for live progress, and native date pickers. It exports to Word and Excel with python-docx and openpyxl. It's deployed on Render.com as a Blueprint — GitHub pushes auto-deploy, a 1-gigabyte persistent disk holds the database and PDF cache, env vars hold the secrets, and HTTP Basic Auth gates the demo. Nightly backups gzip a consistent SQLite snapshot to Backblaze B2. Total run cost is twenty to fifty dollars a month for server plus AI combined, with three built-in optimizations that cut API costs by seventy to ninety percent: smart PDF trimming, prompt caching, and content-hash deduplication. When the county green-lights it, the path to production is SSO via Microsoft MSAL and a swap to managed Postgres — no schema changes required. And because SSO uses the same Microsoft Graph token, the next step after that is a two-way sync with Microsoft Planner so agenda item assignments, statuses, and due dates show up in the Director's Planner dashboard alongside every other OCA project — no double entry, no tab-switching.</w:t>
       </w:r>
     </w:p>
     <w:p>
@@ -1478,6 +1478,106 @@
           <w:szCs w:val="22"/>
         </w:rPr>
         <w:t xml:space="preserve"> — no schema changes required.</w:t>
+      </w:r>
+    </w:p>
+    <w:p>
+      <w:pPr>
+        <w:spacing w:after="200" w:line="340"/>
+      </w:pPr>
+      <w:r>
+        <w:rPr>
+          <w:sz w:val="22"/>
+          <w:szCs w:val="22"/>
+        </w:rPr>
+        <w:t xml:space="preserve">And because SSO uses the same </w:t>
+      </w:r>
+      <w:r>
+        <w:rPr>
+          <w:b/>
+          <w:bCs/>
+          <w:color w:val="003087"/>
+          <w:sz w:val="22"/>
+          <w:szCs w:val="22"/>
+        </w:rPr>
+        <w:t xml:space="preserve">Microsoft Graph</w:t>
+      </w:r>
+      <w:r>
+        <w:rPr>
+          <w:i/>
+          <w:iCs/>
+          <w:color w:val="6B7280"/>
+          <w:sz w:val="22"/>
+          <w:szCs w:val="22"/>
+        </w:rPr>
+        <w:t xml:space="preserve"> — </w:t>
+      </w:r>
+      <w:r>
+        <w:rPr>
+          <w:i/>
+          <w:iCs/>
+          <w:color w:val="6B7280"/>
+          <w:sz w:val="22"/>
+          <w:szCs w:val="22"/>
+        </w:rPr>
+        <w:t xml:space="preserve">Microsoft Graph is the single API that connects to all of Microsoft 365 — email, calendar, Teams, Planner, SharePoint, everything — using one login</w:t>
+      </w:r>
+      <w:r>
+        <w:rPr>
+          <w:sz w:val="22"/>
+          <w:szCs w:val="22"/>
+        </w:rPr>
+        <w:t xml:space="preserve"> </w:t>
+      </w:r>
+      <w:r>
+        <w:rPr>
+          <w:sz w:val="22"/>
+          <w:szCs w:val="22"/>
+        </w:rPr>
+        <w:t xml:space="preserve"> token, the next step is a two-way sync with </w:t>
+      </w:r>
+      <w:r>
+        <w:rPr>
+          <w:b/>
+          <w:bCs/>
+          <w:color w:val="003087"/>
+          <w:sz w:val="22"/>
+          <w:szCs w:val="22"/>
+        </w:rPr>
+        <w:t xml:space="preserve">Microsoft Planner</w:t>
+      </w:r>
+      <w:r>
+        <w:rPr>
+          <w:i/>
+          <w:iCs/>
+          <w:color w:val="6B7280"/>
+          <w:sz w:val="22"/>
+          <w:szCs w:val="22"/>
+        </w:rPr>
+        <w:t xml:space="preserve"> — </w:t>
+      </w:r>
+      <w:r>
+        <w:rPr>
+          <w:i/>
+          <w:iCs/>
+          <w:color w:val="6B7280"/>
+          <w:sz w:val="22"/>
+          <w:szCs w:val="22"/>
+        </w:rPr>
+        <w:t xml:space="preserve">Planner is the task-management tool already in your Microsoft 365 suite — the Director uses it to track all OCA projects in one dashboard</w:t>
+      </w:r>
+      <w:r>
+        <w:rPr>
+          <w:sz w:val="22"/>
+          <w:szCs w:val="22"/>
+        </w:rPr>
+        <w:t xml:space="preserve"> </w:t>
+      </w:r>
+      <w:r>
+        <w:rPr>
+          <w:sz w:val="22"/>
+          <w:szCs w:val="22"/>
+        </w:rPr>
+        <w:t xml:space="preserve"> so agenda item assignments, statuses, and due dates show up in the Director's Planner dashboard alongside every other OCA project — no double entry, no tab-switching.</w:t>
       </w:r>
     </w:p>
     <w:p>
@@ -2380,6 +2480,74 @@
           <w:szCs w:val="22"/>
         </w:rPr>
         <w:t xml:space="preserve">Heavier database that Render runs for you.</w:t>
+      </w:r>
+    </w:p>
+    <w:p>
+      <w:pPr>
+        <w:pStyle w:val="ListParagraph"/>
+        <w:numPr>
+          <w:ilvl w:val="0"/>
+          <w:numId w:val="2"/>
+        </w:numPr>
+        <w:spacing w:after="100" w:line="300"/>
+      </w:pPr>
+      <w:r>
+        <w:rPr>
+          <w:b/>
+          <w:bCs/>
+          <w:color w:val="003087"/>
+          <w:sz w:val="22"/>
+          <w:szCs w:val="22"/>
+        </w:rPr>
+        <w:t xml:space="preserve">Microsoft Graph</w:t>
+      </w:r>
+      <w:r>
+        <w:rPr>
+          <w:sz w:val="22"/>
+          <w:szCs w:val="22"/>
+        </w:rPr>
+        <w:t xml:space="preserve"> — </w:t>
+      </w:r>
+      <w:r>
+        <w:rPr>
+          <w:sz w:val="22"/>
+          <w:szCs w:val="22"/>
+        </w:rPr>
+        <w:t xml:space="preserve">One API that talks to all of Microsoft 365.</w:t>
+      </w:r>
+    </w:p>
+    <w:p>
+      <w:pPr>
+        <w:pStyle w:val="ListParagraph"/>
+        <w:numPr>
+          <w:ilvl w:val="0"/>
+          <w:numId w:val="2"/>
+        </w:numPr>
+        <w:spacing w:after="100" w:line="300"/>
+      </w:pPr>
+      <w:r>
+        <w:rPr>
+          <w:b/>
+          <w:bCs/>
+          <w:color w:val="003087"/>
+          <w:sz w:val="22"/>
+          <w:szCs w:val="22"/>
+        </w:rPr>
+        <w:t xml:space="preserve">Microsoft Planner sync</w:t>
+      </w:r>
+      <w:r>
+        <w:rPr>
+          <w:sz w:val="22"/>
+          <w:szCs w:val="22"/>
+        </w:rPr>
+        <w:t xml:space="preserve"> — </w:t>
+      </w:r>
+      <w:r>
+        <w:rPr>
+          <w:sz w:val="22"/>
+          <w:szCs w:val="22"/>
+        </w:rPr>
+        <w:t xml:space="preserve">Agenda item tasks auto-appear in the Director's Planner board.</w:t>
       </w:r>
     </w:p>
     <w:sectPr>

</xml_diff>

<commit_message>
Fix carry-forward labels, add change detection banners, improve Word export, and add director presentation
- Repository: carry-forward labels now show committee name, date, and item number instead of internal DB IDs
- Repository: finalized_brief (deep research notes) now carries forward between appearances
- App: prominent red/green/yellow change detection banners in Part 1 tab
- App: deep research tab shows carried-forward source banner
- App: AI summary display strips [Carried from ...] prefix for clean reading
- Agent: regex-based prefix stripping replaces fragile startswith loops
- Exporters: bold section headers with colored borders, smarter header detection, ALL-CAPS support
- Added director briefing presentations (v1-v3) and presenter script

Co-Authored-By: Claude Opus 4.6 <noreply@anthropic.com>
</commit_message>
<xml_diff>
--- a/AgendaIQ_Elevator_Pitches.docx
+++ b/AgendaIQ_Elevator_Pitches.docx
@@ -75,7 +75,7 @@
           <w:sz w:val="22"/>
           <w:szCs w:val="22"/>
         </w:rPr>
-        <w:t xml:space="preserve">AgendaIQ is a Flask web app I built to turn Miami-Dade's 500-page commission agendas into something the OCA can actually work with in minutes instead of days. When a new agenda drops on Legistar, the app scrapes it, pulls every linked PDF, runs them through PyMuPDF and Tesseract OCR so even scanned documents become searchable text, and then sends each item to the Anthropic Claude API with a structured prompt that extracts the OCA angle — what matters, what to watch, what to flag. It tracks every item across stages — when something heard at committee shows up on the BCC agenda, it automatically carries forward the researcher's notes and runs a change-detection analysis comparing the two versions so you instantly see what was amended. The full Legistar legislative history is parsed into a timeline for each item. Everything lands in a SQLite database with full audit trails, assignment tracking, notes, and a Part 1 debrief workflow. The front end is a single-page Flask app with mobile-responsive HTML, Server-Sent Events for live progress, and native date pickers. It exports to Word and Excel with python-docx and openpyxl. It's deployed on Render.com as a Blueprint — GitHub pushes auto-deploy, a 1-gigabyte persistent disk holds the database and PDF cache, env vars hold the secrets, and HTTP Basic Auth gates the demo. Nightly backups gzip a consistent SQLite snapshot to Backblaze B2. Total run cost is twenty to fifty dollars a month for server plus AI combined, with three built-in optimizations that cut API costs by seventy to ninety percent: smart PDF trimming, prompt caching, and content-hash deduplication. When the county green-lights it, the path to production is SSO via Microsoft MSAL and a swap to managed Postgres — no schema changes required. And because SSO uses the same Microsoft Graph token, the next step after that is a two-way sync with Microsoft Planner so agenda item assignments, statuses, and due dates show up in the Director's Planner dashboard alongside every other OCA project — no double entry, no tab-switching.</w:t>
+        <w:t xml:space="preserve">AgendaIQ is a Flask web app I built to turn Miami-Dade's commission agendas — 80 to 150 items each, with backing PDFs — into something the OCA can actually work with in minutes instead of days. When a new agenda drops on Legistar, the app scrapes it, pulls every linked PDF, runs them through PyMuPDF and Tesseract OCR so even scanned documents become searchable text, and then sends each item to the Anthropic Claude API with a structured prompt that extracts the OCA angle — what matters, what to watch, what to flag. It tracks every item across stages — when something heard at committee shows up on the BCC agenda, it automatically carries forward the researcher's notes and runs a change-detection analysis comparing the two versions so you instantly see what was amended. The full Legistar legislative history is parsed into a timeline for each item. Everything lands in a SQLite database with full audit trails, assignment tracking, notes, and a Part 1 debrief workflow. The front end is a single-page Flask app with mobile-responsive HTML, Server-Sent Events for live progress, and native date pickers. It exports to Word and Excel with python-docx and openpyxl. It's deployed on Render.com as a Blueprint — GitHub pushes auto-deploy, a 1-gigabyte persistent disk holds the database and PDF cache, env vars hold the secrets, and HTTP Basic Auth gates the demo. Nightly backups gzip a consistent SQLite snapshot to Backblaze B2. Total run cost is twenty to fifty dollars a month for server plus AI combined, with three built-in optimizations that cut API costs by seventy to ninety percent: smart PDF trimming, prompt caching, and content-hash deduplication. When the county green-lights it, the path to production is SSO via Microsoft MSAL and a swap to managed Postgres — no schema changes required. And because SSO uses the same Microsoft Graph token, the next step after that is a two-way sync with Microsoft Planner so agenda item assignments, statuses, and due dates show up in the Director's Planner dashboard alongside every other OCA project — no double entry, no tab-switching.</w:t>
       </w:r>
     </w:p>
     <w:p>
@@ -169,7 +169,7 @@
           <w:sz w:val="22"/>
           <w:szCs w:val="22"/>
         </w:rPr>
-        <w:t xml:space="preserve"> web app I built to turn Miami-Dade's 500-page commission agendas into something the OCA can actually work with in minutes instead of days.</w:t>
+        <w:t xml:space="preserve"> web app I built to turn Miami-Dade's commission agendas — 80 to 150 items each, with backing PDFs — into something the OCA can actually work with in minutes instead of days.</w:t>
       </w:r>
     </w:p>
     <w:p>

</xml_diff>